<commit_message>
Rework MN-INTAKE to v2.4 eleven-section format (v2.0)
Structural:
- Reorganized from 6 sections to 11 sections per v2.4 format
- Added: Process Triggers (2), Process Completion (5), Open Issues (9),
  Updates to Prior Documents (10), Interview Transcript (11)

Content:
- Added MN-INTAKE-REQ-007: auto-assign submitting contact as Engagement
  Contact (per MN-ENGAGE-REQ-009)
- Updated workflow step 2 to reflect Engagement Contact auto-assignment
- Captured MN-INTAKE-ISS-001 (Mentoring Focus Areas TBD values)
- Documented all content decisions in Interview Transcript

Field types:
- Updated all 19 fields to authoritative type names (Text→varchar,
  Dropdown→enum, Multi-select→multiEnum, Rich text→wysiwyg,
  Yes/No→bool, URL→url, Address→address)

No content removed or contradicted from v1.0.
</commit_message>
<xml_diff>
--- a/PRDs/MN/MN-INTAKE.docx
+++ b/PRDs/MN/MN-INTAKE.docx
@@ -264,7 +264,7 @@
                 <w:sz w:val="20"/>
                 <w:szCs w:val="20"/>
               </w:rPr>
-              <w:t xml:space="preserve">1.0</w:t>
+              <w:t xml:space="preserve">2.0</w:t>
             </w:r>
           </w:p>
         </w:tc>
@@ -394,7 +394,7 @@
                 <w:sz w:val="20"/>
                 <w:szCs w:val="20"/>
               </w:rPr>
-              <w:t xml:space="preserve">03-30-26 22:00</w:t>
+              <w:t xml:space="preserve">03-31-26 21:00</w:t>
             </w:r>
           </w:p>
         </w:tc>
@@ -459,7 +459,7 @@
                 <w:sz w:val="20"/>
                 <w:szCs w:val="20"/>
               </w:rPr>
-              <w:t xml:space="preserve">Extracted from CBM-Domain-PRD-Mentoring.md v1.0</w:t>
+              <w:t xml:space="preserve">Reworked from MN-INTAKE v1.0; originally extracted from CBM-Domain-PRD-Mentoring.md v1.0</w:t>
             </w:r>
           </w:p>
         </w:tc>
@@ -485,7 +485,7 @@
           <w:sz w:val="32"/>
           <w:szCs w:val="32"/>
         </w:rPr>
-        <w:t xml:space="preserve">1. Process Purpose and Trigger</w:t>
+        <w:t xml:space="preserve">1. Process Purpose</w:t>
       </w:r>
     </w:p>
     <w:p>
@@ -502,7 +502,7 @@
           <w:sz w:val="22"/>
           <w:szCs w:val="22"/>
         </w:rPr>
-        <w:t xml:space="preserve">The Client Intake process begins when a prospective client submits a mentoring request through the CBM public website. Its purpose is to capture the information needed to assess eligibility and identify an appropriate mentor, and to route the application to the Client Administrator for review.</w:t>
+        <w:t xml:space="preserve">The Client Intake process captures the information needed to assess a prospective client’s eligibility for the mentoring program and to identify an appropriate mentor. It routes the application to the Client Administrator for review and disposition.</w:t>
       </w:r>
     </w:p>
     <w:p>
@@ -537,7 +537,161 @@
           <w:sz w:val="32"/>
           <w:szCs w:val="32"/>
         </w:rPr>
-        <w:t xml:space="preserve">2. Personas Involved</w:t>
+        <w:t xml:space="preserve">2. Process Triggers</w:t>
+      </w:r>
+    </w:p>
+    <w:p>
+      <w:pPr>
+        <w:spacing w:after="40"/>
+      </w:pPr>
+      <w:r>
+        <w:rPr>
+          <w:rFonts w:ascii="Arial" w:cs="Arial" w:eastAsia="Arial" w:hAnsi="Arial"/>
+          <w:b/>
+          <w:bCs/>
+          <w:i w:val="false"/>
+          <w:iCs w:val="false"/>
+          <w:sz w:val="22"/>
+          <w:szCs w:val="22"/>
+        </w:rPr>
+        <w:t xml:space="preserve">Preconditions</w:t>
+      </w:r>
+    </w:p>
+    <w:p>
+      <w:pPr>
+        <w:spacing w:after="120"/>
+      </w:pPr>
+      <w:r>
+        <w:rPr>
+          <w:rFonts w:ascii="Arial" w:cs="Arial" w:eastAsia="Arial" w:hAnsi="Arial"/>
+          <w:b w:val="false"/>
+          <w:bCs w:val="false"/>
+          <w:i w:val="false"/>
+          <w:iCs w:val="false"/>
+          <w:sz w:val="22"/>
+          <w:szCs w:val="22"/>
+        </w:rPr>
+        <w:t xml:space="preserve">None. Client Intake (MN-INTAKE) is the first process in the Mentoring lifecycle. There are no prior processes that must complete and no records that must exist before intake can begin.</w:t>
+      </w:r>
+    </w:p>
+    <w:p>
+      <w:pPr>
+        <w:spacing w:after="40"/>
+      </w:pPr>
+      <w:r>
+        <w:rPr>
+          <w:rFonts w:ascii="Arial" w:cs="Arial" w:eastAsia="Arial" w:hAnsi="Arial"/>
+          <w:b/>
+          <w:bCs/>
+          <w:i w:val="false"/>
+          <w:iCs w:val="false"/>
+          <w:sz w:val="22"/>
+          <w:szCs w:val="22"/>
+        </w:rPr>
+        <w:t xml:space="preserve">Required Data</w:t>
+      </w:r>
+    </w:p>
+    <w:p>
+      <w:pPr>
+        <w:spacing w:after="120"/>
+      </w:pPr>
+      <w:r>
+        <w:rPr>
+          <w:rFonts w:ascii="Arial" w:cs="Arial" w:eastAsia="Arial" w:hAnsi="Arial"/>
+          <w:b w:val="false"/>
+          <w:bCs w:val="false"/>
+          <w:i w:val="false"/>
+          <w:iCs w:val="false"/>
+          <w:sz w:val="22"/>
+          <w:szCs w:val="22"/>
+        </w:rPr>
+        <w:t xml:space="preserve">None. The intake form itself provides all data needed to create the initial records. No pre-existing data in the system is required.</w:t>
+      </w:r>
+    </w:p>
+    <w:p>
+      <w:pPr>
+        <w:spacing w:after="40"/>
+      </w:pPr>
+      <w:r>
+        <w:rPr>
+          <w:rFonts w:ascii="Arial" w:cs="Arial" w:eastAsia="Arial" w:hAnsi="Arial"/>
+          <w:b/>
+          <w:bCs/>
+          <w:i w:val="false"/>
+          <w:iCs w:val="false"/>
+          <w:sz w:val="22"/>
+          <w:szCs w:val="22"/>
+        </w:rPr>
+        <w:t xml:space="preserve">Initiation Mechanism</w:t>
+      </w:r>
+    </w:p>
+    <w:p>
+      <w:pPr>
+        <w:spacing w:after="120"/>
+      </w:pPr>
+      <w:r>
+        <w:rPr>
+          <w:rFonts w:ascii="Arial" w:cs="Arial" w:eastAsia="Arial" w:hAnsi="Arial"/>
+          <w:b w:val="false"/>
+          <w:bCs w:val="false"/>
+          <w:i w:val="false"/>
+          <w:iCs w:val="false"/>
+          <w:sz w:val="22"/>
+          <w:szCs w:val="22"/>
+        </w:rPr>
+        <w:t xml:space="preserve">External form submission. A prospective client completes and submits the Phase 1 Mentoring Request form on the organization’s public website.</w:t>
+      </w:r>
+    </w:p>
+    <w:p>
+      <w:pPr>
+        <w:spacing w:after="40"/>
+      </w:pPr>
+      <w:r>
+        <w:rPr>
+          <w:rFonts w:ascii="Arial" w:cs="Arial" w:eastAsia="Arial" w:hAnsi="Arial"/>
+          <w:b/>
+          <w:bCs/>
+          <w:i w:val="false"/>
+          <w:iCs w:val="false"/>
+          <w:sz w:val="22"/>
+          <w:szCs w:val="22"/>
+        </w:rPr>
+        <w:t xml:space="preserve">Initiating Persona</w:t>
+      </w:r>
+    </w:p>
+    <w:p>
+      <w:pPr>
+        <w:spacing w:after="120"/>
+      </w:pPr>
+      <w:r>
+        <w:rPr>
+          <w:rFonts w:ascii="Arial" w:cs="Arial" w:eastAsia="Arial" w:hAnsi="Arial"/>
+          <w:b w:val="false"/>
+          <w:bCs w:val="false"/>
+          <w:i w:val="false"/>
+          <w:iCs w:val="false"/>
+          <w:sz w:val="22"/>
+          <w:szCs w:val="22"/>
+        </w:rPr>
+        <w:t xml:space="preserve">Client (MST-PER-013). No special authority or system role is required — the form is publicly accessible.</w:t>
+      </w:r>
+    </w:p>
+    <w:p>
+      <w:pPr>
+        <w:pStyle w:val="Heading1"/>
+        <w:spacing w:before="360" w:after="120"/>
+      </w:pPr>
+      <w:r>
+        <w:rPr>
+          <w:rFonts w:ascii="Arial" w:cs="Arial" w:eastAsia="Arial" w:hAnsi="Arial"/>
+          <w:b/>
+          <w:bCs/>
+          <w:i w:val="false"/>
+          <w:iCs w:val="false"/>
+          <w:sz w:val="32"/>
+          <w:szCs w:val="32"/>
+        </w:rPr>
+        <w:t xml:space="preserve">3. Personas Involved</w:t>
       </w:r>
     </w:p>
     <w:p>
@@ -623,7 +777,7 @@
           <w:sz w:val="32"/>
           <w:szCs w:val="32"/>
         </w:rPr>
-        <w:t xml:space="preserve">3. Process Workflow</w:t>
+        <w:t xml:space="preserve">4. Process Workflow</w:t>
       </w:r>
     </w:p>
     <w:p>
@@ -645,7 +799,7 @@
           <w:sz w:val="22"/>
           <w:szCs w:val="22"/>
         </w:rPr>
-        <w:t xml:space="preserve">The prospective client completes and submits the Phase 1 Mentoring Request form on the CBM public website.</w:t>
+        <w:t xml:space="preserve">The prospective client completes and submits the Phase 1 Mentoring Request form on the organization’s public website.</w:t>
       </w:r>
     </w:p>
     <w:p>
@@ -667,7 +821,7 @@
           <w:sz w:val="22"/>
           <w:szCs w:val="22"/>
         </w:rPr>
-        <w:t xml:space="preserve">The system automatically creates three linked records: a Client Organization record (the business), a Client Contact record (the submitting individual, flagged as Primary Contact), and an Engagement record with status Submitted.</w:t>
+        <w:t xml:space="preserve">The system automatically creates three linked records: a Client Organization record (the business), a Client Contact record (the submitting individual, flagged as Primary Contact), and an Engagement record with status Submitted. The submitting contact is automatically assigned as an Engagement Contact on the new Engagement record.</w:t>
       </w:r>
     </w:p>
     <w:p>
@@ -711,7 +865,7 @@
           <w:sz w:val="22"/>
           <w:szCs w:val="22"/>
         </w:rPr>
-        <w:t xml:space="preserve">The Client Administrator reviews the submission for completeness and basic eligibility against CBM’s program criteria.</w:t>
+        <w:t xml:space="preserve">The Client Administrator reviews the submission for completeness and basic eligibility against the organization’s program criteria.</w:t>
       </w:r>
     </w:p>
     <w:p>
@@ -789,7 +943,7 @@
           <w:sz w:val="22"/>
           <w:szCs w:val="22"/>
         </w:rPr>
-        <w:t xml:space="preserve">A structured eligibility screening workflow may be defined by CBM leadership in a future revision. The current process assumes a basic administrative review.</w:t>
+        <w:t xml:space="preserve">A structured eligibility screening workflow may be defined by organizational leadership in a future revision. The current process assumes a basic administrative review.</w:t>
       </w:r>
     </w:p>
     <w:p>
@@ -894,7 +1048,161 @@
           <w:sz w:val="32"/>
           <w:szCs w:val="32"/>
         </w:rPr>
-        <w:t xml:space="preserve">4. System Requirements</w:t>
+        <w:t xml:space="preserve">5. Process Completion</w:t>
+      </w:r>
+    </w:p>
+    <w:p>
+      <w:pPr>
+        <w:spacing w:after="40"/>
+      </w:pPr>
+      <w:r>
+        <w:rPr>
+          <w:rFonts w:ascii="Arial" w:cs="Arial" w:eastAsia="Arial" w:hAnsi="Arial"/>
+          <w:b/>
+          <w:bCs/>
+          <w:i w:val="false"/>
+          <w:iCs w:val="false"/>
+          <w:sz w:val="22"/>
+          <w:szCs w:val="22"/>
+        </w:rPr>
+        <w:t xml:space="preserve">Normal Completion</w:t>
+      </w:r>
+    </w:p>
+    <w:p>
+      <w:pPr>
+        <w:spacing w:after="120"/>
+      </w:pPr>
+      <w:r>
+        <w:rPr>
+          <w:rFonts w:ascii="Arial" w:cs="Arial" w:eastAsia="Arial" w:hAnsi="Arial"/>
+          <w:b w:val="false"/>
+          <w:bCs w:val="false"/>
+          <w:i w:val="false"/>
+          <w:iCs w:val="false"/>
+          <w:sz w:val="22"/>
+          <w:szCs w:val="22"/>
+        </w:rPr>
+        <w:t xml:space="preserve">The Client Administrator approves the application. The Engagement status advances beyond Submitted (the next process, Mentor Matching, takes ownership of further status transitions). The Client Administrator confirms approval, and the application proceeds to Mentor Matching (MN-MATCH).</w:t>
+      </w:r>
+    </w:p>
+    <w:p>
+      <w:pPr>
+        <w:spacing w:after="40"/>
+      </w:pPr>
+      <w:r>
+        <w:rPr>
+          <w:rFonts w:ascii="Arial" w:cs="Arial" w:eastAsia="Arial" w:hAnsi="Arial"/>
+          <w:b/>
+          <w:bCs/>
+          <w:i w:val="false"/>
+          <w:iCs w:val="false"/>
+          <w:sz w:val="22"/>
+          <w:szCs w:val="22"/>
+        </w:rPr>
+        <w:t xml:space="preserve">Alternative End State: Declined</w:t>
+      </w:r>
+    </w:p>
+    <w:p>
+      <w:pPr>
+        <w:spacing w:after="120"/>
+      </w:pPr>
+      <w:r>
+        <w:rPr>
+          <w:rFonts w:ascii="Arial" w:cs="Arial" w:eastAsia="Arial" w:hAnsi="Arial"/>
+          <w:b w:val="false"/>
+          <w:bCs w:val="false"/>
+          <w:i w:val="false"/>
+          <w:iCs w:val="false"/>
+          <w:sz w:val="22"/>
+          <w:szCs w:val="22"/>
+        </w:rPr>
+        <w:t xml:space="preserve">The Client Administrator determines the applicant does not meet program criteria. The Engagement status is set to Declined with a recorded reason. The Client Administrator notifies the applicant directly. This end state is final — a declined application is not reopened. If the applicant reapplies, a new intake submission creates new records.</w:t>
+      </w:r>
+    </w:p>
+    <w:p>
+      <w:pPr>
+        <w:spacing w:after="40"/>
+      </w:pPr>
+      <w:r>
+        <w:rPr>
+          <w:rFonts w:ascii="Arial" w:cs="Arial" w:eastAsia="Arial" w:hAnsi="Arial"/>
+          <w:b/>
+          <w:bCs/>
+          <w:i w:val="false"/>
+          <w:iCs w:val="false"/>
+          <w:sz w:val="22"/>
+          <w:szCs w:val="22"/>
+        </w:rPr>
+        <w:t xml:space="preserve">Record Retention</w:t>
+      </w:r>
+    </w:p>
+    <w:p>
+      <w:pPr>
+        <w:spacing w:after="120"/>
+      </w:pPr>
+      <w:r>
+        <w:rPr>
+          <w:rFonts w:ascii="Arial" w:cs="Arial" w:eastAsia="Arial" w:hAnsi="Arial"/>
+          <w:b w:val="false"/>
+          <w:bCs w:val="false"/>
+          <w:i w:val="false"/>
+          <w:iCs w:val="false"/>
+          <w:sz w:val="22"/>
+          <w:szCs w:val="22"/>
+        </w:rPr>
+        <w:t xml:space="preserve">All records created during intake (Client Organization, Client Contact, Engagement) are retained permanently regardless of outcome. Declined applications remain in the system for reporting and historical reference.</w:t>
+      </w:r>
+    </w:p>
+    <w:p>
+      <w:pPr>
+        <w:spacing w:after="40"/>
+      </w:pPr>
+      <w:r>
+        <w:rPr>
+          <w:rFonts w:ascii="Arial" w:cs="Arial" w:eastAsia="Arial" w:hAnsi="Arial"/>
+          <w:b/>
+          <w:bCs/>
+          <w:i w:val="false"/>
+          <w:iCs w:val="false"/>
+          <w:sz w:val="22"/>
+          <w:szCs w:val="22"/>
+        </w:rPr>
+        <w:t xml:space="preserve">Post-Completion Handoff</w:t>
+      </w:r>
+    </w:p>
+    <w:p>
+      <w:pPr>
+        <w:spacing w:after="120"/>
+      </w:pPr>
+      <w:r>
+        <w:rPr>
+          <w:rFonts w:ascii="Arial" w:cs="Arial" w:eastAsia="Arial" w:hAnsi="Arial"/>
+          <w:b w:val="false"/>
+          <w:bCs w:val="false"/>
+          <w:i w:val="false"/>
+          <w:iCs w:val="false"/>
+          <w:sz w:val="22"/>
+          <w:szCs w:val="22"/>
+        </w:rPr>
+        <w:t xml:space="preserve">Approved applications proceed to Mentor Matching (MN-MATCH). The Mentor Matching process requires the Client Organization, Client Contact, and Engagement records created by this process as its input.</w:t>
+      </w:r>
+    </w:p>
+    <w:p>
+      <w:pPr>
+        <w:pStyle w:val="Heading1"/>
+        <w:spacing w:before="360" w:after="120"/>
+      </w:pPr>
+      <w:r>
+        <w:rPr>
+          <w:rFonts w:ascii="Arial" w:cs="Arial" w:eastAsia="Arial" w:hAnsi="Arial"/>
+          <w:b/>
+          <w:bCs/>
+          <w:i w:val="false"/>
+          <w:iCs w:val="false"/>
+          <w:sz w:val="32"/>
+          <w:szCs w:val="32"/>
+        </w:rPr>
+        <w:t xml:space="preserve">6. System Requirements</w:t>
       </w:r>
     </w:p>
     <w:tbl>
@@ -1371,6 +1679,70 @@
           </w:p>
         </w:tc>
       </w:tr>
+      <w:tr>
+        <w:tc>
+          <w:tcPr>
+            <w:tcW w:type="dxa" w:w="2000"/>
+            <w:tcBorders>
+              <w:top w:val="single" w:color="AAAAAA" w:sz="1"/>
+              <w:left w:val="single" w:color="AAAAAA" w:sz="1"/>
+              <w:bottom w:val="single" w:color="AAAAAA" w:sz="1"/>
+              <w:right w:val="single" w:color="AAAAAA" w:sz="1"/>
+            </w:tcBorders>
+            <w:tcMar>
+              <w:top w:type="dxa" w:w="60"/>
+              <w:left w:type="dxa" w:w="100"/>
+              <w:bottom w:type="dxa" w:w="60"/>
+              <w:right w:type="dxa" w:w="100"/>
+            </w:tcMar>
+          </w:tcPr>
+          <w:p>
+            <w:r>
+              <w:rPr>
+                <w:rFonts w:ascii="Arial" w:cs="Arial" w:eastAsia="Arial" w:hAnsi="Arial"/>
+                <w:b/>
+                <w:bCs/>
+                <w:i w:val="false"/>
+                <w:iCs w:val="false"/>
+                <w:sz w:val="20"/>
+                <w:szCs w:val="20"/>
+              </w:rPr>
+              <w:t xml:space="preserve">MN-INTAKE-REQ-007</w:t>
+            </w:r>
+          </w:p>
+        </w:tc>
+        <w:tc>
+          <w:tcPr>
+            <w:tcW w:type="dxa" w:w="7360"/>
+            <w:tcBorders>
+              <w:top w:val="single" w:color="AAAAAA" w:sz="1"/>
+              <w:left w:val="single" w:color="AAAAAA" w:sz="1"/>
+              <w:bottom w:val="single" w:color="AAAAAA" w:sz="1"/>
+              <w:right w:val="single" w:color="AAAAAA" w:sz="1"/>
+            </w:tcBorders>
+            <w:tcMar>
+              <w:top w:type="dxa" w:w="60"/>
+              <w:left w:type="dxa" w:w="100"/>
+              <w:bottom w:type="dxa" w:w="60"/>
+              <w:right w:type="dxa" w:w="100"/>
+            </w:tcMar>
+          </w:tcPr>
+          <w:p>
+            <w:r>
+              <w:rPr>
+                <w:rFonts w:ascii="Arial" w:cs="Arial" w:eastAsia="Arial" w:hAnsi="Arial"/>
+                <w:b w:val="false"/>
+                <w:bCs w:val="false"/>
+                <w:i w:val="false"/>
+                <w:iCs w:val="false"/>
+                <w:sz w:val="20"/>
+                <w:szCs w:val="20"/>
+              </w:rPr>
+              <w:t xml:space="preserve">The system must automatically assign the submitting contact as an Engagement Contact on the new Engagement record when it is created.</w:t>
+            </w:r>
+          </w:p>
+        </w:tc>
+      </w:tr>
     </w:tbl>
     <w:p>
       <w:pPr>
@@ -1387,7 +1759,7 @@
           <w:sz w:val="32"/>
           <w:szCs w:val="32"/>
         </w:rPr>
-        <w:t xml:space="preserve">5. Process Data</w:t>
+        <w:t xml:space="preserve">7. Process Data</w:t>
       </w:r>
     </w:p>
     <w:p>
@@ -1404,7 +1776,7 @@
           <w:sz w:val="22"/>
           <w:szCs w:val="22"/>
         </w:rPr>
-        <w:t xml:space="preserve">The Client Intake process does not require pre-existing data. It is the first process in the Mentoring lifecycle and creates all of its own records from the submitted intake form. The submitted application itself is the data the Client Administrator reviews to assess eligibility.</w:t>
+        <w:t xml:space="preserve">The Client Intake process does not reference pre-existing data. It is the first process in the Mentoring lifecycle and creates all of its own records from the submitted intake form. The submitted application itself is the data the Client Administrator reviews to assess eligibility.</w:t>
       </w:r>
     </w:p>
     <w:p>
@@ -1422,7 +1794,7 @@
           <w:sz w:val="32"/>
           <w:szCs w:val="32"/>
         </w:rPr>
-        <w:t xml:space="preserve">6. Data Collected</w:t>
+        <w:t xml:space="preserve">8. Data Collected</w:t>
       </w:r>
     </w:p>
     <w:p>
@@ -1739,7 +2111,7 @@
                 <w:sz w:val="20"/>
                 <w:szCs w:val="20"/>
               </w:rPr>
-              <w:t xml:space="preserve">Text</w:t>
+              <w:t xml:space="preserve">varchar</w:t>
             </w:r>
           </w:p>
         </w:tc>
@@ -1965,7 +2337,7 @@
                 <w:sz w:val="20"/>
                 <w:szCs w:val="20"/>
               </w:rPr>
-              <w:t xml:space="preserve">URL</w:t>
+              <w:t xml:space="preserve">url</w:t>
             </w:r>
           </w:p>
         </w:tc>
@@ -2194,7 +2566,7 @@
                 <w:sz w:val="20"/>
                 <w:szCs w:val="20"/>
               </w:rPr>
-              <w:t xml:space="preserve">Address</w:t>
+              <w:t xml:space="preserve">address</w:t>
             </w:r>
           </w:p>
         </w:tc>
@@ -2420,7 +2792,7 @@
                 <w:sz w:val="20"/>
                 <w:szCs w:val="20"/>
               </w:rPr>
-              <w:t xml:space="preserve">Dropdown</w:t>
+              <w:t xml:space="preserve">enum</w:t>
             </w:r>
           </w:p>
         </w:tc>
@@ -2649,7 +3021,7 @@
                 <w:sz w:val="20"/>
                 <w:szCs w:val="20"/>
               </w:rPr>
-              <w:t xml:space="preserve">Dropdown</w:t>
+              <w:t xml:space="preserve">enum</w:t>
             </w:r>
           </w:p>
         </w:tc>
@@ -2875,7 +3247,7 @@
                 <w:sz w:val="20"/>
                 <w:szCs w:val="20"/>
               </w:rPr>
-              <w:t xml:space="preserve">Dropdown</w:t>
+              <w:t xml:space="preserve">enum</w:t>
             </w:r>
           </w:p>
         </w:tc>
@@ -3104,7 +3476,7 @@
                 <w:sz w:val="20"/>
                 <w:szCs w:val="20"/>
               </w:rPr>
-              <w:t xml:space="preserve">Dropdown</w:t>
+              <w:t xml:space="preserve">enum</w:t>
             </w:r>
           </w:p>
         </w:tc>
@@ -3584,7 +3956,7 @@
                 <w:sz w:val="20"/>
                 <w:szCs w:val="20"/>
               </w:rPr>
-              <w:t xml:space="preserve">Text</w:t>
+              <w:t xml:space="preserve">varchar</w:t>
             </w:r>
           </w:p>
         </w:tc>
@@ -3810,7 +4182,7 @@
                 <w:sz w:val="20"/>
                 <w:szCs w:val="20"/>
               </w:rPr>
-              <w:t xml:space="preserve">Text</w:t>
+              <w:t xml:space="preserve">varchar</w:t>
             </w:r>
           </w:p>
         </w:tc>
@@ -4039,7 +4411,7 @@
                 <w:sz w:val="20"/>
                 <w:szCs w:val="20"/>
               </w:rPr>
-              <w:t xml:space="preserve">Text</w:t>
+              <w:t xml:space="preserve">varchar</w:t>
             </w:r>
           </w:p>
         </w:tc>
@@ -4265,7 +4637,7 @@
                 <w:sz w:val="20"/>
                 <w:szCs w:val="20"/>
               </w:rPr>
-              <w:t xml:space="preserve">Text</w:t>
+              <w:t xml:space="preserve">varchar</w:t>
             </w:r>
           </w:p>
         </w:tc>
@@ -4494,7 +4866,7 @@
                 <w:sz w:val="20"/>
                 <w:szCs w:val="20"/>
               </w:rPr>
-              <w:t xml:space="preserve">Email</w:t>
+              <w:t xml:space="preserve">email</w:t>
             </w:r>
           </w:p>
         </w:tc>
@@ -4654,7 +5026,7 @@
                 <w:sz w:val="20"/>
                 <w:szCs w:val="20"/>
               </w:rPr>
-              <w:t xml:space="preserve">The contact’s primary email address. Used for all CBM communications including mentor introduction, meeting requests, and satisfaction surveys.</w:t>
+              <w:t xml:space="preserve">The contact’s primary email address. Used for all communications including mentor introduction, meeting requests, and satisfaction surveys.</w:t>
             </w:r>
           </w:p>
         </w:tc>
@@ -4720,7 +5092,7 @@
                 <w:sz w:val="20"/>
                 <w:szCs w:val="20"/>
               </w:rPr>
-              <w:t xml:space="preserve">Phone</w:t>
+              <w:t xml:space="preserve">phone</w:t>
             </w:r>
           </w:p>
         </w:tc>
@@ -4949,7 +5321,7 @@
                 <w:sz w:val="20"/>
                 <w:szCs w:val="20"/>
               </w:rPr>
-              <w:t xml:space="preserve">Text</w:t>
+              <w:t xml:space="preserve">varchar</w:t>
             </w:r>
           </w:p>
         </w:tc>
@@ -5175,7 +5547,7 @@
                 <w:sz w:val="20"/>
                 <w:szCs w:val="20"/>
               </w:rPr>
-              <w:t xml:space="preserve">URL</w:t>
+              <w:t xml:space="preserve">url</w:t>
             </w:r>
           </w:p>
         </w:tc>
@@ -5404,7 +5776,7 @@
                 <w:sz w:val="20"/>
                 <w:szCs w:val="20"/>
               </w:rPr>
-              <w:t xml:space="preserve">Yes/No</w:t>
+              <w:t xml:space="preserve">bool</w:t>
             </w:r>
           </w:p>
         </w:tc>
@@ -5884,7 +6256,7 @@
                 <w:sz w:val="20"/>
                 <w:szCs w:val="20"/>
               </w:rPr>
-              <w:t xml:space="preserve">Dropdown</w:t>
+              <w:t xml:space="preserve">enum</w:t>
             </w:r>
           </w:p>
         </w:tc>
@@ -6110,7 +6482,7 @@
                 <w:sz w:val="20"/>
                 <w:szCs w:val="20"/>
               </w:rPr>
-              <w:t xml:space="preserve">Multi-select</w:t>
+              <w:t xml:space="preserve">multiEnum</w:t>
             </w:r>
           </w:p>
         </w:tc>
@@ -6174,7 +6546,7 @@
                 <w:sz w:val="20"/>
                 <w:szCs w:val="20"/>
               </w:rPr>
-              <w:t xml:space="preserve">TBD — see MN-ISS-001</w:t>
+              <w:t xml:space="preserve">TBD — see MN-INTAKE-ISS-001</w:t>
             </w:r>
           </w:p>
         </w:tc>
@@ -6339,7 +6711,7 @@
                 <w:sz w:val="20"/>
                 <w:szCs w:val="20"/>
               </w:rPr>
-              <w:t xml:space="preserve">Rich text</w:t>
+              <w:t xml:space="preserve">wysiwyg</w:t>
             </w:r>
           </w:p>
         </w:tc>
@@ -6505,6 +6877,634 @@
         </w:tc>
       </w:tr>
     </w:tbl>
+    <w:p>
+      <w:pPr>
+        <w:pStyle w:val="Heading1"/>
+        <w:spacing w:before="360" w:after="120"/>
+      </w:pPr>
+      <w:r>
+        <w:rPr>
+          <w:rFonts w:ascii="Arial" w:cs="Arial" w:eastAsia="Arial" w:hAnsi="Arial"/>
+          <w:b/>
+          <w:bCs/>
+          <w:i w:val="false"/>
+          <w:iCs w:val="false"/>
+          <w:sz w:val="32"/>
+          <w:szCs w:val="32"/>
+        </w:rPr>
+        <w:t xml:space="preserve">9. Open Issues</w:t>
+      </w:r>
+    </w:p>
+    <w:tbl>
+      <w:tblPr>
+        <w:tblW w:type="dxa" w:w="9360"/>
+        <w:tblBorders>
+          <w:top w:val="single" w:color="auto" w:sz="4"/>
+          <w:left w:val="single" w:color="auto" w:sz="4"/>
+          <w:bottom w:val="single" w:color="auto" w:sz="4"/>
+          <w:right w:val="single" w:color="auto" w:sz="4"/>
+          <w:insideH w:val="single" w:color="auto" w:sz="4"/>
+          <w:insideV w:val="single" w:color="auto" w:sz="4"/>
+        </w:tblBorders>
+      </w:tblPr>
+      <w:tblGrid>
+        <w:gridCol w:w="2000"/>
+        <w:gridCol w:w="7360"/>
+      </w:tblGrid>
+      <w:tr>
+        <w:tc>
+          <w:tcPr>
+            <w:tcW w:type="dxa" w:w="2000"/>
+            <w:tcBorders>
+              <w:top w:val="single" w:color="AAAAAA" w:sz="1"/>
+              <w:left w:val="single" w:color="AAAAAA" w:sz="1"/>
+              <w:bottom w:val="single" w:color="AAAAAA" w:sz="1"/>
+              <w:right w:val="single" w:color="AAAAAA" w:sz="1"/>
+            </w:tcBorders>
+            <w:shd w:fill="1F3864" w:val="clear"/>
+            <w:tcMar>
+              <w:top w:type="dxa" w:w="60"/>
+              <w:left w:type="dxa" w:w="100"/>
+              <w:bottom w:type="dxa" w:w="60"/>
+              <w:right w:type="dxa" w:w="100"/>
+            </w:tcMar>
+          </w:tcPr>
+          <w:p>
+            <w:r>
+              <w:rPr>
+                <w:rFonts w:ascii="Arial" w:cs="Arial" w:eastAsia="Arial" w:hAnsi="Arial"/>
+                <w:b/>
+                <w:bCs/>
+                <w:i w:val="false"/>
+                <w:iCs w:val="false"/>
+                <w:color w:val="FFFFFF"/>
+                <w:sz w:val="20"/>
+                <w:szCs w:val="20"/>
+              </w:rPr>
+              <w:t xml:space="preserve">ID</w:t>
+            </w:r>
+          </w:p>
+        </w:tc>
+        <w:tc>
+          <w:tcPr>
+            <w:tcW w:type="dxa" w:w="7360"/>
+            <w:tcBorders>
+              <w:top w:val="single" w:color="AAAAAA" w:sz="1"/>
+              <w:left w:val="single" w:color="AAAAAA" w:sz="1"/>
+              <w:bottom w:val="single" w:color="AAAAAA" w:sz="1"/>
+              <w:right w:val="single" w:color="AAAAAA" w:sz="1"/>
+            </w:tcBorders>
+            <w:shd w:fill="1F3864" w:val="clear"/>
+            <w:tcMar>
+              <w:top w:type="dxa" w:w="60"/>
+              <w:left w:type="dxa" w:w="100"/>
+              <w:bottom w:type="dxa" w:w="60"/>
+              <w:right w:type="dxa" w:w="100"/>
+            </w:tcMar>
+          </w:tcPr>
+          <w:p>
+            <w:r>
+              <w:rPr>
+                <w:rFonts w:ascii="Arial" w:cs="Arial" w:eastAsia="Arial" w:hAnsi="Arial"/>
+                <w:b/>
+                <w:bCs/>
+                <w:i w:val="false"/>
+                <w:iCs w:val="false"/>
+                <w:color w:val="FFFFFF"/>
+                <w:sz w:val="20"/>
+                <w:szCs w:val="20"/>
+              </w:rPr>
+              <w:t xml:space="preserve">Issue</w:t>
+            </w:r>
+          </w:p>
+        </w:tc>
+      </w:tr>
+      <w:tr>
+        <w:tc>
+          <w:tcPr>
+            <w:tcW w:type="dxa" w:w="2000"/>
+            <w:tcBorders>
+              <w:top w:val="single" w:color="AAAAAA" w:sz="1"/>
+              <w:left w:val="single" w:color="AAAAAA" w:sz="1"/>
+              <w:bottom w:val="single" w:color="AAAAAA" w:sz="1"/>
+              <w:right w:val="single" w:color="AAAAAA" w:sz="1"/>
+            </w:tcBorders>
+            <w:tcMar>
+              <w:top w:type="dxa" w:w="60"/>
+              <w:left w:type="dxa" w:w="100"/>
+              <w:bottom w:type="dxa" w:w="60"/>
+              <w:right w:type="dxa" w:w="100"/>
+            </w:tcMar>
+          </w:tcPr>
+          <w:p>
+            <w:r>
+              <w:rPr>
+                <w:rFonts w:ascii="Arial" w:cs="Arial" w:eastAsia="Arial" w:hAnsi="Arial"/>
+                <w:b/>
+                <w:bCs/>
+                <w:i w:val="false"/>
+                <w:iCs w:val="false"/>
+                <w:sz w:val="20"/>
+                <w:szCs w:val="20"/>
+              </w:rPr>
+              <w:t xml:space="preserve">MN-INTAKE-ISS-001</w:t>
+            </w:r>
+          </w:p>
+        </w:tc>
+        <w:tc>
+          <w:tcPr>
+            <w:tcW w:type="dxa" w:w="7360"/>
+            <w:tcBorders>
+              <w:top w:val="single" w:color="AAAAAA" w:sz="1"/>
+              <w:left w:val="single" w:color="AAAAAA" w:sz="1"/>
+              <w:bottom w:val="single" w:color="AAAAAA" w:sz="1"/>
+              <w:right w:val="single" w:color="AAAAAA" w:sz="1"/>
+            </w:tcBorders>
+            <w:tcMar>
+              <w:top w:type="dxa" w:w="60"/>
+              <w:left w:type="dxa" w:w="100"/>
+              <w:bottom w:type="dxa" w:w="60"/>
+              <w:right w:type="dxa" w:w="100"/>
+            </w:tcMar>
+          </w:tcPr>
+          <w:p>
+            <w:r>
+              <w:rPr>
+                <w:rFonts w:ascii="Arial" w:cs="Arial" w:eastAsia="Arial" w:hAnsi="Arial"/>
+                <w:b w:val="false"/>
+                <w:bCs w:val="false"/>
+                <w:i w:val="false"/>
+                <w:iCs w:val="false"/>
+                <w:sz w:val="20"/>
+                <w:szCs w:val="20"/>
+              </w:rPr>
+              <w:t xml:space="preserve">Mentoring Focus Areas (MN-INTAKE-DAT-018): The complete list of allowed values has not been defined. Values must align with the corresponding field on the Mentor profile (defined in the Mentor Recruitment domain). Needs input from: CBM program leadership and Mentor Recruitment domain definition.</w:t>
+            </w:r>
+          </w:p>
+        </w:tc>
+      </w:tr>
+    </w:tbl>
+    <w:p>
+      <w:pPr>
+        <w:pStyle w:val="Heading1"/>
+        <w:spacing w:before="360" w:after="120"/>
+      </w:pPr>
+      <w:r>
+        <w:rPr>
+          <w:rFonts w:ascii="Arial" w:cs="Arial" w:eastAsia="Arial" w:hAnsi="Arial"/>
+          <w:b/>
+          <w:bCs/>
+          <w:i w:val="false"/>
+          <w:iCs w:val="false"/>
+          <w:sz w:val="32"/>
+          <w:szCs w:val="32"/>
+        </w:rPr>
+        <w:t xml:space="preserve">10. Updates to Prior Documents</w:t>
+      </w:r>
+    </w:p>
+    <w:p>
+      <w:pPr>
+        <w:spacing w:after="120"/>
+      </w:pPr>
+      <w:r>
+        <w:rPr>
+          <w:rFonts w:ascii="Arial" w:cs="Arial" w:eastAsia="Arial" w:hAnsi="Arial"/>
+          <w:b w:val="false"/>
+          <w:bCs w:val="false"/>
+          <w:i w:val="false"/>
+          <w:iCs w:val="false"/>
+          <w:sz w:val="22"/>
+          <w:szCs w:val="22"/>
+        </w:rPr>
+        <w:t xml:space="preserve">No updates to prior documents were identified. Client Intake (MN-INTAKE) is the first process defined in the Mentoring domain; there are no prior process documents to update.</w:t>
+      </w:r>
+    </w:p>
+    <w:p>
+      <w:pPr>
+        <w:spacing w:after="120"/>
+      </w:pPr>
+      <w:r>
+        <w:rPr>
+          <w:rFonts w:ascii="Arial" w:cs="Arial" w:eastAsia="Arial" w:hAnsi="Arial"/>
+          <w:b w:val="false"/>
+          <w:bCs w:val="false"/>
+          <w:i/>
+          <w:iCs/>
+          <w:sz w:val="22"/>
+          <w:szCs w:val="22"/>
+        </w:rPr>
+        <w:t xml:space="preserve">Note: During the Engagement Management (MN-ENGAGE) session, MN-ENGAGE-REQ-009 was identified as requiring a corresponding requirement in this document. That requirement has been added as MN-INTAKE-REQ-007 and the workflow step 2 has been updated to reflect the automatic Engagement Contact assignment.</w:t>
+      </w:r>
+    </w:p>
+    <w:p>
+      <w:pPr>
+        <w:pStyle w:val="Heading1"/>
+        <w:spacing w:before="360" w:after="120"/>
+      </w:pPr>
+      <w:r>
+        <w:rPr>
+          <w:rFonts w:ascii="Arial" w:cs="Arial" w:eastAsia="Arial" w:hAnsi="Arial"/>
+          <w:b/>
+          <w:bCs/>
+          <w:i w:val="false"/>
+          <w:iCs w:val="false"/>
+          <w:sz w:val="32"/>
+          <w:szCs w:val="32"/>
+        </w:rPr>
+        <w:t xml:space="preserve">11. Interview Transcript</w:t>
+      </w:r>
+    </w:p>
+    <w:p>
+      <w:pPr>
+        <w:spacing w:after="120"/>
+      </w:pPr>
+      <w:r>
+        <w:rPr>
+          <w:rFonts w:ascii="Arial" w:cs="Arial" w:eastAsia="Arial" w:hAnsi="Arial"/>
+          <w:b w:val="false"/>
+          <w:bCs w:val="false"/>
+          <w:i w:val="false"/>
+          <w:iCs w:val="false"/>
+          <w:sz w:val="22"/>
+          <w:szCs w:val="22"/>
+        </w:rPr>
+        <w:t xml:space="preserve">This document was not produced through a live interview. The content was originally extracted from CBM-Domain-PRD-Mentoring.md v1.0 and restructured into the process document format. The following decisions and content changes have been applied across sessions:</w:t>
+      </w:r>
+    </w:p>
+    <w:p>
+      <w:pPr>
+        <w:spacing w:after="40"/>
+      </w:pPr>
+      <w:r>
+        <w:rPr>
+          <w:rFonts w:ascii="Arial" w:cs="Arial" w:eastAsia="Arial" w:hAnsi="Arial"/>
+          <w:b/>
+          <w:bCs/>
+          <w:i w:val="false"/>
+          <w:iCs w:val="false"/>
+          <w:sz w:val="22"/>
+          <w:szCs w:val="22"/>
+        </w:rPr>
+        <w:t xml:space="preserve">Document Origin</w:t>
+      </w:r>
+    </w:p>
+    <w:p>
+      <w:pPr>
+        <w:spacing w:after="40"/>
+      </w:pPr>
+      <w:r>
+        <w:rPr>
+          <w:rFonts w:ascii="Arial" w:cs="Arial" w:eastAsia="Arial" w:hAnsi="Arial"/>
+          <w:b w:val="false"/>
+          <w:bCs w:val="false"/>
+          <w:i/>
+          <w:iCs/>
+          <w:sz w:val="22"/>
+          <w:szCs w:val="22"/>
+        </w:rPr>
+        <w:t xml:space="preserve">Q: What is the source material for this process document?</w:t>
+      </w:r>
+    </w:p>
+    <w:p>
+      <w:pPr>
+        <w:spacing w:after="80"/>
+      </w:pPr>
+      <w:r>
+        <w:rPr>
+          <w:rFonts w:ascii="Arial" w:cs="Arial" w:eastAsia="Arial" w:hAnsi="Arial"/>
+          <w:b w:val="false"/>
+          <w:bCs w:val="false"/>
+          <w:i w:val="false"/>
+          <w:iCs w:val="false"/>
+          <w:sz w:val="22"/>
+          <w:szCs w:val="22"/>
+        </w:rPr>
+        <w:t xml:space="preserve">A: The Client Intake process was extracted from Section 4 (Mentoring Domain) of CBM-Domain-PRD-Mentoring.md v1.0, which documented the full Mentoring lifecycle based on interviews with the CBM administrator.</w:t>
+      </w:r>
+    </w:p>
+    <w:p>
+      <w:pPr>
+        <w:spacing w:after="40"/>
+      </w:pPr>
+      <w:r>
+        <w:rPr>
+          <w:rFonts w:ascii="Arial" w:cs="Arial" w:eastAsia="Arial" w:hAnsi="Arial"/>
+          <w:b/>
+          <w:bCs/>
+          <w:i w:val="false"/>
+          <w:iCs w:val="false"/>
+          <w:sz w:val="22"/>
+          <w:szCs w:val="22"/>
+        </w:rPr>
+        <w:t xml:space="preserve">Content Decisions Applied from Prior Sessions</w:t>
+      </w:r>
+    </w:p>
+    <w:p>
+      <w:pPr>
+        <w:spacing w:after="40"/>
+      </w:pPr>
+      <w:r>
+        <w:rPr>
+          <w:rFonts w:ascii="Arial" w:cs="Arial" w:eastAsia="Arial" w:hAnsi="Arial"/>
+          <w:b w:val="false"/>
+          <w:bCs w:val="false"/>
+          <w:i/>
+          <w:iCs/>
+          <w:sz w:val="22"/>
+          <w:szCs w:val="22"/>
+        </w:rPr>
+        <w:t xml:space="preserve">Q: Where do Mentoring Focus Areas and Mentoring Needs Description belong — on Client Organization or Engagement?</w:t>
+      </w:r>
+    </w:p>
+    <w:p>
+      <w:pPr>
+        <w:spacing w:after="40"/>
+      </w:pPr>
+      <w:r>
+        <w:rPr>
+          <w:rFonts w:ascii="Arial" w:cs="Arial" w:eastAsia="Arial" w:hAnsi="Arial"/>
+          <w:b w:val="false"/>
+          <w:bCs w:val="false"/>
+          <w:i w:val="false"/>
+          <w:iCs w:val="false"/>
+          <w:sz w:val="22"/>
+          <w:szCs w:val="22"/>
+        </w:rPr>
+        <w:t xml:space="preserve">A: On the Engagement entity. These describe what the client needs from a specific mentoring engagement, not characteristics of the business itself. A client could have multiple engagements with different focus areas.</w:t>
+      </w:r>
+    </w:p>
+    <w:p>
+      <w:pPr>
+        <w:spacing w:after="80"/>
+      </w:pPr>
+      <w:r>
+        <w:rPr>
+          <w:rFonts w:ascii="Arial" w:cs="Arial" w:eastAsia="Arial" w:hAnsi="Arial"/>
+          <w:b/>
+          <w:bCs/>
+          <w:i w:val="false"/>
+          <w:iCs w:val="false"/>
+          <w:sz w:val="22"/>
+          <w:szCs w:val="22"/>
+        </w:rPr>
+        <w:t xml:space="preserve">Decision: Mentoring Focus Areas and Mentoring Needs Description moved from Client Organization to Engagement. DAT identifiers renumbered accordingly (MN-INTAKE-DAT-001 through DAT-019).</w:t>
+      </w:r>
+    </w:p>
+    <w:p>
+      <w:pPr>
+        <w:spacing w:after="40"/>
+      </w:pPr>
+      <w:r>
+        <w:rPr>
+          <w:rFonts w:ascii="Arial" w:cs="Arial" w:eastAsia="Arial" w:hAnsi="Arial"/>
+          <w:b w:val="false"/>
+          <w:bCs w:val="false"/>
+          <w:i/>
+          <w:iCs/>
+          <w:sz w:val="22"/>
+          <w:szCs w:val="22"/>
+        </w:rPr>
+        <w:t xml:space="preserve">Q: Should Middle Name, Preferred Name, and LinkedIn Profile be added to Client Contact?</w:t>
+      </w:r>
+    </w:p>
+    <w:p>
+      <w:pPr>
+        <w:spacing w:after="40"/>
+      </w:pPr>
+      <w:r>
+        <w:rPr>
+          <w:rFonts w:ascii="Arial" w:cs="Arial" w:eastAsia="Arial" w:hAnsi="Arial"/>
+          <w:b w:val="false"/>
+          <w:bCs w:val="false"/>
+          <w:i w:val="false"/>
+          <w:iCs w:val="false"/>
+          <w:sz w:val="22"/>
+          <w:szCs w:val="22"/>
+        </w:rPr>
+        <w:t xml:space="preserve">A: Yes. Middle Name and Preferred Name support personalized communications. LinkedIn Profile provides mentors with professional background context during matching.</w:t>
+      </w:r>
+    </w:p>
+    <w:p>
+      <w:pPr>
+        <w:spacing w:after="80"/>
+      </w:pPr>
+      <w:r>
+        <w:rPr>
+          <w:rFonts w:ascii="Arial" w:cs="Arial" w:eastAsia="Arial" w:hAnsi="Arial"/>
+          <w:b/>
+          <w:bCs/>
+          <w:i w:val="false"/>
+          <w:iCs w:val="false"/>
+          <w:sz w:val="22"/>
+          <w:szCs w:val="22"/>
+        </w:rPr>
+        <w:t xml:space="preserve">Decision: Middle Name (DAT-010), Preferred Name (DAT-011), and LinkedIn Profile (DAT-015) added to Client Contact.</w:t>
+      </w:r>
+    </w:p>
+    <w:p>
+      <w:pPr>
+        <w:spacing w:after="40"/>
+      </w:pPr>
+      <w:r>
+        <w:rPr>
+          <w:rFonts w:ascii="Arial" w:cs="Arial" w:eastAsia="Arial" w:hAnsi="Arial"/>
+          <w:b w:val="false"/>
+          <w:bCs w:val="false"/>
+          <w:i/>
+          <w:iCs/>
+          <w:sz w:val="22"/>
+          <w:szCs w:val="22"/>
+        </w:rPr>
+        <w:t xml:space="preserve">Q: Should Phone be required on Client Contact?</w:t>
+      </w:r>
+    </w:p>
+    <w:p>
+      <w:pPr>
+        <w:spacing w:after="40"/>
+      </w:pPr>
+      <w:r>
+        <w:rPr>
+          <w:rFonts w:ascii="Arial" w:cs="Arial" w:eastAsia="Arial" w:hAnsi="Arial"/>
+          <w:b w:val="false"/>
+          <w:bCs w:val="false"/>
+          <w:i w:val="false"/>
+          <w:iCs w:val="false"/>
+          <w:sz w:val="22"/>
+          <w:szCs w:val="22"/>
+        </w:rPr>
+        <w:t xml:space="preserve">A: Yes. Phone is a primary communication channel for mentor-client interactions.</w:t>
+      </w:r>
+    </w:p>
+    <w:p>
+      <w:pPr>
+        <w:spacing w:after="80"/>
+      </w:pPr>
+      <w:r>
+        <w:rPr>
+          <w:rFonts w:ascii="Arial" w:cs="Arial" w:eastAsia="Arial" w:hAnsi="Arial"/>
+          <w:b/>
+          <w:bCs/>
+          <w:i w:val="false"/>
+          <w:iCs w:val="false"/>
+          <w:sz w:val="22"/>
+          <w:szCs w:val="22"/>
+        </w:rPr>
+        <w:t xml:space="preserve">Decision: Phone changed from Required: No to Required: Yes.</w:t>
+      </w:r>
+    </w:p>
+    <w:p>
+      <w:pPr>
+        <w:spacing w:after="40"/>
+      </w:pPr>
+      <w:r>
+        <w:rPr>
+          <w:rFonts w:ascii="Arial" w:cs="Arial" w:eastAsia="Arial" w:hAnsi="Arial"/>
+          <w:b w:val="false"/>
+          <w:bCs w:val="false"/>
+          <w:i/>
+          <w:iCs/>
+          <w:sz w:val="22"/>
+          <w:szCs w:val="22"/>
+        </w:rPr>
+        <w:t xml:space="preserve">Q: Should Close Date and Close Reason be defined in MN-INTAKE?</w:t>
+      </w:r>
+    </w:p>
+    <w:p>
+      <w:pPr>
+        <w:spacing w:after="40"/>
+      </w:pPr>
+      <w:r>
+        <w:rPr>
+          <w:rFonts w:ascii="Arial" w:cs="Arial" w:eastAsia="Arial" w:hAnsi="Arial"/>
+          <w:b w:val="false"/>
+          <w:bCs w:val="false"/>
+          <w:i w:val="false"/>
+          <w:iCs w:val="false"/>
+          <w:sz w:val="22"/>
+          <w:szCs w:val="22"/>
+        </w:rPr>
+        <w:t xml:space="preserve">A: No. These fields are only relevant when an engagement is being formally closed. They belong in the Engagement Closure process (MN-CLOSE).</w:t>
+      </w:r>
+    </w:p>
+    <w:p>
+      <w:pPr>
+        <w:spacing w:after="80"/>
+      </w:pPr>
+      <w:r>
+        <w:rPr>
+          <w:rFonts w:ascii="Arial" w:cs="Arial" w:eastAsia="Arial" w:hAnsi="Arial"/>
+          <w:b/>
+          <w:bCs/>
+          <w:i w:val="false"/>
+          <w:iCs w:val="false"/>
+          <w:sz w:val="22"/>
+          <w:szCs w:val="22"/>
+        </w:rPr>
+        <w:t xml:space="preserve">Decision: Close Date and Close Reason removed from MN-INTAKE. They will be defined in MN-CLOSE.</w:t>
+      </w:r>
+    </w:p>
+    <w:p>
+      <w:pPr>
+        <w:spacing w:after="40"/>
+      </w:pPr>
+      <w:r>
+        <w:rPr>
+          <w:rFonts w:ascii="Arial" w:cs="Arial" w:eastAsia="Arial" w:hAnsi="Arial"/>
+          <w:b/>
+          <w:bCs/>
+          <w:i w:val="false"/>
+          <w:iCs w:val="false"/>
+          <w:sz w:val="22"/>
+          <w:szCs w:val="22"/>
+        </w:rPr>
+        <w:t xml:space="preserve">Content Decision Applied from MN-ENGAGE Session</w:t>
+      </w:r>
+    </w:p>
+    <w:p>
+      <w:pPr>
+        <w:spacing w:after="40"/>
+      </w:pPr>
+      <w:r>
+        <w:rPr>
+          <w:rFonts w:ascii="Arial" w:cs="Arial" w:eastAsia="Arial" w:hAnsi="Arial"/>
+          <w:b w:val="false"/>
+          <w:bCs w:val="false"/>
+          <w:i/>
+          <w:iCs/>
+          <w:sz w:val="22"/>
+          <w:szCs w:val="22"/>
+        </w:rPr>
+        <w:t xml:space="preserve">Q: MN-ENGAGE-REQ-009 states that the submitting contact from Client Intake must be automatically assigned as an Engagement Contact when the Engagement is created. Should this be documented in MN-INTAKE?</w:t>
+      </w:r>
+    </w:p>
+    <w:p>
+      <w:pPr>
+        <w:spacing w:after="40"/>
+      </w:pPr>
+      <w:r>
+        <w:rPr>
+          <w:rFonts w:ascii="Arial" w:cs="Arial" w:eastAsia="Arial" w:hAnsi="Arial"/>
+          <w:b w:val="false"/>
+          <w:bCs w:val="false"/>
+          <w:i w:val="false"/>
+          <w:iCs w:val="false"/>
+          <w:sz w:val="22"/>
+          <w:szCs w:val="22"/>
+        </w:rPr>
+        <w:t xml:space="preserve">A: Yes. The behavior occurs at Engagement creation time, which is during Client Intake. It should be a requirement in MN-INTAKE and reflected in the workflow.</w:t>
+      </w:r>
+    </w:p>
+    <w:p>
+      <w:pPr>
+        <w:spacing w:after="80"/>
+      </w:pPr>
+      <w:r>
+        <w:rPr>
+          <w:rFonts w:ascii="Arial" w:cs="Arial" w:eastAsia="Arial" w:hAnsi="Arial"/>
+          <w:b/>
+          <w:bCs/>
+          <w:i w:val="false"/>
+          <w:iCs w:val="false"/>
+          <w:sz w:val="22"/>
+          <w:szCs w:val="22"/>
+        </w:rPr>
+        <w:t xml:space="preserve">Decision: Added MN-INTAKE-REQ-007 (automatic Engagement Contact assignment). Updated workflow step 2 to include this behavior.</w:t>
+      </w:r>
+    </w:p>
+    <w:p>
+      <w:pPr>
+        <w:spacing w:after="40"/>
+      </w:pPr>
+      <w:r>
+        <w:rPr>
+          <w:rFonts w:ascii="Arial" w:cs="Arial" w:eastAsia="Arial" w:hAnsi="Arial"/>
+          <w:b/>
+          <w:bCs/>
+          <w:i w:val="false"/>
+          <w:iCs w:val="false"/>
+          <w:sz w:val="22"/>
+          <w:szCs w:val="22"/>
+        </w:rPr>
+        <w:t xml:space="preserve">V2.0 Restructuring</w:t>
+      </w:r>
+    </w:p>
+    <w:p>
+      <w:pPr>
+        <w:spacing w:after="120"/>
+      </w:pPr>
+      <w:r>
+        <w:rPr>
+          <w:rFonts w:ascii="Arial" w:cs="Arial" w:eastAsia="Arial" w:hAnsi="Arial"/>
+          <w:b w:val="false"/>
+          <w:bCs w:val="false"/>
+          <w:i w:val="false"/>
+          <w:iCs w:val="false"/>
+          <w:sz w:val="22"/>
+          <w:szCs w:val="22"/>
+        </w:rPr>
+        <w:t xml:space="preserve">This version restructures the document from the original six-section format to the v2.4 eleven-section format. No content was removed or contradicted — existing content was reorganized into the new structure and new sections (Process Triggers, Process Completion, Open Issues, Updates to Prior Documents, Interview Transcript) were added. Field type names were updated to use the authoritative type list (e.g., Text → varchar, Dropdown → enum, Yes/No → bool).</w:t>
+      </w:r>
+    </w:p>
     <w:sectPr>
       <w:headerReference w:type="default" r:id="rId6"/>
       <w:footerReference w:type="default" r:id="rId7"/>

</xml_diff>

<commit_message>
docs(MN-INTAKE): v2.5 — rename applicantSince to applicantSinceTimestamp
Documentation-only correction with no requirement or behavior changes.

Renames every reference to applicantSince to applicantSinceTimestamp to align with the canonical field name in the Account Entity PRD v1.8 and the deployed CR-Account.yaml. Eight references updated across Section 6 (MN-INTAKE-REQ-011 body), Section 8 (Client Organization table — MN-INTAKE-DAT-027 field name and description), and the Section 10 v2.4 historical entry. New v2.5 change log entry appended to Section 10 documenting the correction.

Session 3 of 4 of the MN PRD vs YAML verification-pass workpacket; addresses Finding #6.
</commit_message>
<xml_diff>
--- a/PRDs/MN/MN-INTAKE.docx
+++ b/PRDs/MN/MN-INTAKE.docx
@@ -249,7 +249,7 @@
           </w:tcPr>
           <w:p>
             <w:r>
-              <w:t>2.4</w:t>
+              <w:t>2.5</w:t>
             </w:r>
           </w:p>
         </w:tc>
@@ -360,7 +360,7 @@
           </w:tcPr>
           <w:p>
             <w:r>
-              <w:t>04-16-26 01:00</w:t>
+              <w:t>05-05-26 05:24</w:t>
             </w:r>
           </w:p>
         </w:tc>
@@ -2075,7 +2075,7 @@
               <w:rPr/>
             </w:pPr>
             <w:r>
-              <w:t>When the application is processed and an Account is associated with the application — either by linking to an existing Account or by creating a new Account using the existing pre-startup naming logic from MN-INTAKE-REQ-008 — the system must set Account.clientStatus to Applicant, and system-populate Account.applicantSince with the current datetime if applicantSince is currently null. The “if currently null” guard ensures the timestamp records the first time the account reached Applicant status, not subsequent re-applications. If the Account already existed at clientStatus = Prospect (because it was created earlier via a CR-MARKETING pathway with company information provided), the value transitions to Applicant. If a new Account is created at this step, clientStatus = Applicant is set at creation and applicantSince is set to the current datetime. Source: CR-MARKETING Sub-Domain Overview v1.0; applicantSince clause added per CR-EVENTS-CONVERT v1.0.</w:t>
+              <w:t>When the application is processed and an Account is associated with the application — either by linking to an existing Account or by creating a new Account using the existing pre-startup naming logic from MN-INTAKE-REQ-008 — the system must set Account.clientStatus to Applicant, and system-populate Account.applicantSinceTimestamp with the current datetime if applicantSinceTimestamp is currently null. The “if currently null” guard ensures the timestamp records the first time the account reached Applicant status, not subsequent re-applications. If the Account already existed at clientStatus = Prospect (because it was created earlier via a CR-MARKETING pathway with company information provided), the value transitions to Applicant. If a new Account is created at this step, clientStatus = Applicant is set at creation and applicantSinceTimestamp is set to the current datetime. Source: CR-MARKETING Sub-Domain Overview v1.0; applicantSinceTimestamp clause added per CR-EVENTS-CONVERT v1.0.</w:t>
             </w:r>
           </w:p>
         </w:tc>
@@ -4254,7 +4254,7 @@
           </w:tcPr>
           <w:p>
             <w:r>
-              <w:t>applicantSince</w:t>
+              <w:t>applicantSinceTimestamp</w:t>
             </w:r>
           </w:p>
         </w:tc>
@@ -4317,7 +4317,7 @@
           </w:tcPr>
           <w:p>
             <w:r>
-              <w:t>Source: System-set. Timestamp recording when this Account’s clientStatus first transitioned to Applicant. Set to the current datetime when Account.clientStatus is set to Applicant, but only if applicantSince is currently null (preserves the first transition timestamp). Added per CR-EVENTS-CONVERT v1.0.</w:t>
+              <w:t>Source: System-set. Timestamp recording when this Account’s clientStatus first transitioned to Applicant. Set to the current datetime when Account.clientStatus is set to Applicant, but only if applicantSinceTimestamp is currently null (preserves the first transition timestamp). Added per CR-EVENTS-CONVERT v1.0.</w:t>
             </w:r>
           </w:p>
         </w:tc>
@@ -9163,7 +9163,20 @@
     </w:p>
     <w:p>
       <w:r>
-        <w:t>MN-INTAKE v2.4 extends MN-INTAKE-REQ-011 to include system-population of Account.applicantSince with the current datetime when the intake process transitions clientStatus to Applicant. The applicantSince field is added to the Client Organization data table as MN-INTAKE-DAT-027. The “if currently null” guard ensures the timestamp records the first time the account reached Applicant status.</w:t>
+        <w:t>MN-INTAKE v2.4 extends MN-INTAKE-REQ-011 to include system-population of Account.applicantSinceTimestamp with the current datetime when the intake process transitions clientStatus to Applicant. The applicantSinceTimestamp field is added to the Client Organization data table as MN-INTAKE-DAT-027. The “if currently null” guard ensures the timestamp records the first time the account reached Applicant status.</w:t>
+      </w:r>
+    </w:p>
+    <w:p>
+      <w:r>
+        <w:rPr>
+          <w:b/>
+        </w:rPr>
+        <w:t>Documentation correction from MN PRD vs YAML verification pass (05-05-26)</w:t>
+      </w:r>
+    </w:p>
+    <w:p>
+      <w:r>
+        <w:t>v2.5: Field name correction. Every reference to applicantSince in this document has been renamed to applicantSinceTimestamp to align with the canonical field name in the Account Entity PRD v1.8 and the deployed CR-Account.yaml. No requirement or behavior changes. Surfaced by the MN PRD vs YAML verification pass on 05-05-26.</w:t>
       </w:r>
     </w:p>
     <w:p>

</xml_diff>